<commit_message>
docs: restructure SOM from SAM×0.5-1% to SAM×10%
SOM redefined as "obtainable market" (SAM × ~10% = $91M-$165M)
instead of revenue target (SAM × 0.5-1% = $4.6M-$16.5M).

Revenue targets ($7M yr3, $24M yr5) now positioned as share
within SOM rather than SOM itself.

Updated 11 locations across SOT doc and bizplan DOCX:
- SOT: summary, table, diagram, section 10, section 13
- DOCX: SOM table, SOM description, revenue milestones, growth text

Co-Authored-By: Claude Opus 4.6 (1M context) <noreply@anthropic.com>
</commit_message>
<xml_diff>
--- a/docs/예창패 실제 제풀용/claudecode/2026년 예비창업패키지 사업계획서_페르소닉AI_수정중_SOM수정.docx
+++ b/docs/예창패 실제 제풀용/claudecode/2026년 예비창업패키지 사업계획서_페르소닉AI_수정중_SOM수정.docx
@@ -4912,22 +4912,8 @@
             <w:tcW w:w="2126" w:type="dxa"/>
           </w:tcPr>
           <w:p>
-            <w:pPr>
-              <w:pStyle w:val="a4"/>
-              <w:jc w:val="center"/>
-              <w:rPr>
-                <w:rFonts w:asciiTheme="minorEastAsia" w:eastAsiaTheme="minorEastAsia" w:hAnsiTheme="minorEastAsia"/>
-                <w:sz w:val="20"/>
-                <w:szCs w:val="20"/>
-              </w:rPr>
-            </w:pPr>
-            <w:r>
-              <w:rPr>
-                <w:rFonts w:asciiTheme="minorEastAsia" w:eastAsiaTheme="minorEastAsia" w:hAnsiTheme="minorEastAsia"/>
-                <w:sz w:val="20"/>
-                <w:szCs w:val="20"/>
-              </w:rPr>
-              <w:t>$4.6M~$16.5M</w:t>
+            <w:r>
+              <w:t>$91M~$165M</w:t>
             </w:r>
           </w:p>
         </w:tc>
@@ -4936,22 +4922,8 @@
             <w:tcW w:w="5386" w:type="dxa"/>
           </w:tcPr>
           <w:p>
-            <w:pPr>
-              <w:pStyle w:val="a4"/>
-              <w:jc w:val="center"/>
-              <w:rPr>
-                <w:rFonts w:asciiTheme="minorEastAsia" w:eastAsiaTheme="minorEastAsia" w:hAnsiTheme="minorEastAsia"/>
-                <w:sz w:val="20"/>
-                <w:szCs w:val="20"/>
-              </w:rPr>
-            </w:pPr>
-            <w:r>
-              <w:rPr>
-                <w:rFonts w:asciiTheme="minorEastAsia" w:eastAsiaTheme="minorEastAsia" w:hAnsiTheme="minorEastAsia"/>
-                <w:sz w:val="20"/>
-                <w:szCs w:val="20"/>
-              </w:rPr>
-              <w:t>SAM의 0.5-1.0%, 1차 진입시장 $0.9M-$3.3M</w:t>
+            <w:r>
+              <w:t>SAM의 약 10%, 카테고리 형성기 획득 가능 시장</w:t>
             </w:r>
           </w:p>
         </w:tc>
@@ -5001,19 +4973,17 @@
         <w:rPr>
           <w:rFonts w:asciiTheme="minorEastAsia" w:eastAsiaTheme="minorEastAsia" w:hAnsiTheme="minorEastAsia"/>
         </w:rPr>
-        <w:t>SOM</w:t>
+        <w:t>SOM 산정 근거 — 합성 페르소나 카테고리는 형성 초기이며 지배적 플레이어가 부재하다. 18개월간 $163M 이상의 VC 투자가 유입된 점, 초기 카테고리에서 상위 플레이어들이 확보 가능한 시장 비중(Forum VC 기준 SAM의 5~10%)을 근거로 SAM의 약 10%를 SOM으로 산정하였다. 당사는 이 SOM 내에서 3년차 $7M, 5년차 $24M을 단계적 매출 목표로 설정하였다.</w:t>
       </w:r>
       <w:r>
         <w:rPr>
           <w:rFonts w:asciiTheme="minorEastAsia" w:eastAsiaTheme="minorEastAsia" w:hAnsiTheme="minorEastAsia" w:hint="eastAsia"/>
         </w:rPr>
-        <w:t xml:space="preserve"> 산정 근거 </w:t>
       </w:r>
       <w:r>
         <w:rPr>
           <w:rFonts w:asciiTheme="minorEastAsia" w:eastAsiaTheme="minorEastAsia" w:hAnsiTheme="minorEastAsia"/>
         </w:rPr>
-        <w:t>— SAM의 0.5-1.0%를 3-5년 내 점유 목표로 설정하였다.</w:t>
       </w:r>
     </w:p>
     <w:p>
@@ -13795,7 +13765,7 @@
           <w:b/>
           <w:bCs/>
         </w:rPr>
-        <w:t xml:space="preserve">매출 </w:t>
+        <w:t>매출 추정 : SOM 내 매출 목표 달성은 다섯 가지 레버로 달성한다. 한국에서 검증 후 글로벌로 확장하고(지역 확장), 1인 서비스 개발자에서 스타트업 PM·UX팀·엔터프라이즈로 고객군을 넓히며(고객 확장), 월·연간 계약으로 객단가를 올린다(ARPU 상승). 동시에 기본 3개 유형에서 대규모 여론·시장반응 시뮬레이션, A/B 테스트·전문가 리뷰를 추가하고(유형 확장), 웹에서 모바일 앱까지 시뮬레이션 대상을 확대한다(플랫폼 확장).</w:t>
       </w:r>
       <w:proofErr w:type="gramStart"/>
       <w:r>
@@ -13804,7 +13774,6 @@
           <w:b/>
           <w:bCs/>
         </w:rPr>
-        <w:t>추정</w:t>
       </w:r>
       <w:r>
         <w:rPr>
@@ -13812,111 +13781,92 @@
           <w:b/>
           <w:bCs/>
         </w:rPr>
-        <w:t xml:space="preserve"> :</w:t>
       </w:r>
       <w:proofErr w:type="gramEnd"/>
       <w:r>
         <w:rPr>
           <w:rFonts w:asciiTheme="minorEastAsia" w:eastAsiaTheme="minorEastAsia" w:hAnsiTheme="minorEastAsia" w:hint="eastAsia"/>
         </w:rPr>
-        <w:t xml:space="preserve"> </w:t>
       </w:r>
       <w:r>
         <w:rPr>
           <w:rFonts w:asciiTheme="minorEastAsia" w:eastAsiaTheme="minorEastAsia" w:hAnsiTheme="minorEastAsia"/>
         </w:rPr>
-        <w:t xml:space="preserve">SOM까지의 성장은 다섯 가지 레버로 달성한다. 한국에서 검증 후 글로벌로 </w:t>
       </w:r>
       <w:r>
         <w:rPr>
           <w:rFonts w:asciiTheme="minorEastAsia" w:eastAsiaTheme="minorEastAsia" w:hAnsiTheme="minorEastAsia"/>
         </w:rPr>
-        <w:t xml:space="preserve">확장하고(지역 확장), </w:t>
       </w:r>
       <w:r>
         <w:rPr>
           <w:rFonts w:asciiTheme="minorEastAsia" w:eastAsiaTheme="minorEastAsia" w:hAnsiTheme="minorEastAsia" w:hint="eastAsia"/>
         </w:rPr>
-        <w:t>1인 서비스 개발자</w:t>
       </w:r>
       <w:r>
         <w:rPr>
           <w:rFonts w:asciiTheme="minorEastAsia" w:eastAsiaTheme="minorEastAsia" w:hAnsiTheme="minorEastAsia"/>
         </w:rPr>
-        <w:t>에서 스타트업 PM·UX팀·엔터프라이즈로 고객군을 넓히며(고객 확장),</w:t>
       </w:r>
       <w:r>
         <w:rPr>
           <w:rFonts w:asciiTheme="minorEastAsia" w:eastAsiaTheme="minorEastAsia" w:hAnsiTheme="minorEastAsia" w:hint="eastAsia"/>
         </w:rPr>
-        <w:t xml:space="preserve"> 월</w:t>
       </w:r>
       <w:r>
         <w:rPr>
           <w:rFonts w:asciiTheme="minorEastAsia" w:eastAsiaTheme="minorEastAsia" w:hAnsiTheme="minorEastAsia"/>
         </w:rPr>
-        <w:t>·</w:t>
       </w:r>
       <w:r>
         <w:rPr>
           <w:rFonts w:asciiTheme="minorEastAsia" w:eastAsiaTheme="minorEastAsia" w:hAnsiTheme="minorEastAsia"/>
         </w:rPr>
-        <w:t xml:space="preserve">연간 계약으로 객단가를 올린다(ARPU 상승). 동시에 기본 3개 </w:t>
       </w:r>
       <w:r>
         <w:rPr>
           <w:rFonts w:asciiTheme="minorEastAsia" w:eastAsiaTheme="minorEastAsia" w:hAnsiTheme="minorEastAsia"/>
         </w:rPr>
-        <w:t>유형</w:t>
       </w:r>
       <w:r>
         <w:rPr>
           <w:rFonts w:asciiTheme="minorEastAsia" w:eastAsiaTheme="minorEastAsia" w:hAnsiTheme="minorEastAsia"/>
         </w:rPr>
-        <w:t xml:space="preserve">에서 </w:t>
       </w:r>
       <w:r>
         <w:rPr>
           <w:rFonts w:asciiTheme="minorEastAsia" w:eastAsiaTheme="minorEastAsia" w:hAnsiTheme="minorEastAsia" w:hint="eastAsia"/>
         </w:rPr>
-        <w:t>대규모</w:t>
       </w:r>
       <w:r>
         <w:rPr>
           <w:rFonts w:asciiTheme="minorEastAsia" w:eastAsiaTheme="minorEastAsia" w:hAnsiTheme="minorEastAsia"/>
         </w:rPr>
-        <w:t xml:space="preserve"> 여론·시장반응 시뮬레이션</w:t>
       </w:r>
       <w:r>
         <w:rPr>
           <w:rFonts w:asciiTheme="minorEastAsia" w:eastAsiaTheme="minorEastAsia" w:hAnsiTheme="minorEastAsia" w:hint="eastAsia"/>
         </w:rPr>
-        <w:t xml:space="preserve">, </w:t>
       </w:r>
       <w:r>
         <w:rPr>
           <w:rFonts w:asciiTheme="minorEastAsia" w:eastAsiaTheme="minorEastAsia" w:hAnsiTheme="minorEastAsia"/>
         </w:rPr>
-        <w:t>A/B 테스트·전문가 리뷰를 추가하고(</w:t>
       </w:r>
       <w:r>
         <w:rPr>
           <w:rFonts w:asciiTheme="minorEastAsia" w:eastAsiaTheme="minorEastAsia" w:hAnsiTheme="minorEastAsia"/>
         </w:rPr>
-        <w:t>유형</w:t>
       </w:r>
       <w:r>
         <w:rPr>
           <w:rFonts w:asciiTheme="minorEastAsia" w:eastAsiaTheme="minorEastAsia" w:hAnsiTheme="minorEastAsia"/>
         </w:rPr>
-        <w:t xml:space="preserve"> 확장), 웹에서 </w:t>
       </w:r>
       <w:r>
         <w:rPr>
           <w:rFonts w:asciiTheme="minorEastAsia" w:eastAsiaTheme="minorEastAsia" w:hAnsiTheme="minorEastAsia"/>
         </w:rPr>
-        <w:lastRenderedPageBreak/>
-        <w:t>모바일 앱까지 시뮬레이션 대상을 확대한다(플랫폼 확장).</w:t>
       </w:r>
     </w:p>
     <w:tbl>
@@ -14220,22 +14170,8 @@
             <w:tcW w:w="6804" w:type="dxa"/>
           </w:tcPr>
           <w:p>
-            <w:pPr>
-              <w:pStyle w:val="a4"/>
-              <w:jc w:val="center"/>
-              <w:rPr>
-                <w:rFonts w:asciiTheme="minorEastAsia" w:eastAsiaTheme="minorEastAsia" w:hAnsiTheme="minorEastAsia"/>
-                <w:sz w:val="20"/>
-                <w:szCs w:val="20"/>
-              </w:rPr>
-            </w:pPr>
-            <w:r>
-              <w:rPr>
-                <w:rFonts w:asciiTheme="minorEastAsia" w:eastAsiaTheme="minorEastAsia" w:hAnsiTheme="minorEastAsia"/>
-                <w:sz w:val="20"/>
-                <w:szCs w:val="20"/>
-              </w:rPr>
-              <w:t>고객 7,000명, 기업형 에이전시 고객 확보, SOM 달성</w:t>
+            <w:r>
+              <w:t>고객 7,000명, 기업형 에이전시 고객 확보, SOM 내 초기 점유 확보</w:t>
             </w:r>
           </w:p>
         </w:tc>
@@ -14297,22 +14233,8 @@
             <w:tcW w:w="6804" w:type="dxa"/>
           </w:tcPr>
           <w:p>
-            <w:pPr>
-              <w:pStyle w:val="a4"/>
-              <w:jc w:val="center"/>
-              <w:rPr>
-                <w:rFonts w:asciiTheme="minorEastAsia" w:eastAsiaTheme="minorEastAsia" w:hAnsiTheme="minorEastAsia"/>
-                <w:sz w:val="20"/>
-                <w:szCs w:val="20"/>
-              </w:rPr>
-            </w:pPr>
-            <w:r>
-              <w:rPr>
-                <w:rFonts w:asciiTheme="minorEastAsia" w:eastAsiaTheme="minorEastAsia" w:hAnsiTheme="minorEastAsia"/>
-                <w:sz w:val="20"/>
-                <w:szCs w:val="20"/>
-              </w:rPr>
-              <w:t>리서치 서비스 영역 진입, SOM 초과</w:t>
+            <w:r>
+              <w:t>리서치 서비스 영역 진입, SOM 내 점유 확대</w:t>
             </w:r>
           </w:p>
         </w:tc>

</xml_diff>

<commit_message>
docs: adjust SOM from SAM×10% to SAM×5%
SAM×10% ($91M-$165M) was disproportionate to category reality
($163M total VC investment). Revised to SAM×5% ($45M-$82M)
which aligns with Forum VC/ICanPitch Year 5 benchmarks (1-5%).

Revenue targets ($7M yr3, $24M yr5) unchanged and fit within SOM.

Co-Authored-By: Claude Opus 4.6 (1M context) <noreply@anthropic.com>
</commit_message>
<xml_diff>
--- a/docs/예창패 실제 제풀용/claudecode/2026년 예비창업패키지 사업계획서_페르소닉AI_수정중_SOM수정.docx
+++ b/docs/예창패 실제 제풀용/claudecode/2026년 예비창업패키지 사업계획서_페르소닉AI_수정중_SOM수정.docx
@@ -4913,7 +4913,7 @@
           </w:tcPr>
           <w:p>
             <w:r>
-              <w:t>$91M~$165M</w:t>
+              <w:t>$45M~$82M</w:t>
             </w:r>
           </w:p>
         </w:tc>
@@ -4923,7 +4923,7 @@
           </w:tcPr>
           <w:p>
             <w:r>
-              <w:t>SAM의 약 10%, 카테고리 형성기 획득 가능 시장</w:t>
+              <w:t>SAM의 약 5%, 3~5년 내 당사 획득 가능 시장</w:t>
             </w:r>
           </w:p>
         </w:tc>
@@ -4973,7 +4973,7 @@
         <w:rPr>
           <w:rFonts w:asciiTheme="minorEastAsia" w:eastAsiaTheme="minorEastAsia" w:hAnsiTheme="minorEastAsia"/>
         </w:rPr>
-        <w:t>SOM 산정 근거 — 합성 페르소나 카테고리는 형성 초기이며 지배적 플레이어가 부재하다. 18개월간 $163M 이상의 VC 투자가 유입된 점, 초기 카테고리에서 상위 플레이어들이 확보 가능한 시장 비중(Forum VC 기준 SAM의 5~10%)을 근거로 SAM의 약 10%를 SOM으로 산정하였다. 당사는 이 SOM 내에서 3년차 $7M, 5년차 $24M을 단계적 매출 목표로 설정하였다.</w:t>
+        <w:t>SOM 산정 근거 — 합성 페르소나 카테고리는 형성 초기(주요 4~5개사, 총 $163M+ 투자)이며 지배적 플레이어가 부재하다. B2B SaaS 스타트업의 SOM 벤치마크(SAM의 1~5%, Forum VC·ICanPitch)에서 상한인 5%를 적용하여 $45M~$82M을 SOM으로 산정하였다.</w:t>
       </w:r>
       <w:r>
         <w:rPr>

</xml_diff>

<commit_message>
docs: finalize SOM 5% and revenue projections
SOM = SAM × 5% = $45M-$82M (final).

Revenue projections revised upward with ARPU growth:
- 1yr: $240K → $290K
- 3yr: $7M → $10.5M (7,000 customers × $1,500 ARPU)
- 5yr: $24M → $50M (20,000 customers × $2,500 ARPU)

5yr $50M now fits within SOM range, resolving the
previous mismatch where SOM exceeded revenue targets.

Co-Authored-By: Claude Opus 4.6 (1M context) <noreply@anthropic.com>
</commit_message>
<xml_diff>
--- a/docs/예창패 실제 제풀용/claudecode/2026년 예비창업패키지 사업계획서_페르소닉AI_수정중_SOM수정.docx
+++ b/docs/예창패 실제 제풀용/claudecode/2026년 예비창업패키지 사업계획서_페르소닉AI_수정중_SOM수정.docx
@@ -4913,7 +4913,7 @@
           </w:tcPr>
           <w:p>
             <w:r>
-              <w:t>$45M~$82M</w:t>
+              <w:t>$45M-$82M</w:t>
             </w:r>
           </w:p>
         </w:tc>
@@ -4923,7 +4923,7 @@
           </w:tcPr>
           <w:p>
             <w:r>
-              <w:t>SAM의 약 5%, 3~5년 내 당사 획득 가능 시장</w:t>
+              <w:t>SAM의 약 5%, 3-5년 내 당사 획득 가능 시장</w:t>
             </w:r>
           </w:p>
         </w:tc>
@@ -4973,7 +4973,7 @@
         <w:rPr>
           <w:rFonts w:asciiTheme="minorEastAsia" w:eastAsiaTheme="minorEastAsia" w:hAnsiTheme="minorEastAsia"/>
         </w:rPr>
-        <w:t>SOM 산정 근거 — 합성 페르소나 카테고리는 형성 초기(주요 4~5개사, 총 $163M+ 투자)이며 지배적 플레이어가 부재하다. B2B SaaS 스타트업의 SOM 벤치마크(SAM의 1~5%, Forum VC·ICanPitch)에서 상한인 5%를 적용하여 $45M~$82M을 SOM으로 산정하였다.</w:t>
+        <w:t>SOM 산정 근거 — 합성 페르소나 카테고리는 형성 초기(주요 4-5개사, 총 $163M+ 투자)이며 지배적 플레이어가 부재하다. B2B SaaS 스타트업의 SOM 벤치마크(SAM의 1-5%, Forum VC·ICanPitch)에서 상한인 5%를 적용하여 $45M-$82M을 SOM으로 산정하였다. 당사는 3년차 $10.5M, 5년차 $50M을 매출 목표로 설정하였다.</w:t>
       </w:r>
       <w:r>
         <w:rPr>
@@ -13765,7 +13765,7 @@
           <w:b/>
           <w:bCs/>
         </w:rPr>
-        <w:t>매출 추정 : SOM 내 매출 목표 달성은 다섯 가지 레버로 달성한다. 한국에서 검증 후 글로벌로 확장하고(지역 확장), 1인 서비스 개발자에서 스타트업 PM·UX팀·엔터프라이즈로 고객군을 넓히며(고객 확장), 월·연간 계약으로 객단가를 올린다(ARPU 상승). 동시에 기본 3개 유형에서 대규모 여론·시장반응 시뮬레이션, A/B 테스트·전문가 리뷰를 추가하고(유형 확장), 웹에서 모바일 앱까지 시뮬레이션 대상을 확대한다(플랫폼 확장).</w:t>
+        <w:t>매출 추정 : SOM 달성까지의 성장은 다섯 가지 레버로 달성한다. 한국에서 검증 후 글로벌로 확장하고(지역 확장), 1인 서비스 개발자에서 스타트업 PM·UX팀·엔터프라이즈로 고객군을 넓히며(고객 확장), 월·연간 계약으로 객단가를 올린다(ARPU 상승). 동시에 기본 3개 유형에서 대규모 여론·시장반응 시뮬레이션, A/B 테스트·전문가 리뷰를 추가하고(유형 확장), 웹에서 모바일 앱까지 시뮬레이션 대상을 확대한다(플랫폼 확장).</w:t>
       </w:r>
       <w:proofErr w:type="gramStart"/>
       <w:r>
@@ -14070,21 +14070,8 @@
             <w:tcW w:w="1276" w:type="dxa"/>
           </w:tcPr>
           <w:p>
-            <w:pPr>
-              <w:jc w:val="center"/>
-              <w:rPr>
-                <w:rFonts w:asciiTheme="minorEastAsia" w:eastAsiaTheme="minorEastAsia" w:hAnsiTheme="minorEastAsia" w:cs="Segoe UI"/>
-                <w:sz w:val="20"/>
-                <w:szCs w:val="20"/>
-              </w:rPr>
-            </w:pPr>
-            <w:r>
-              <w:rPr>
-                <w:rFonts w:asciiTheme="minorEastAsia" w:eastAsiaTheme="minorEastAsia" w:hAnsiTheme="minorEastAsia" w:cs="Segoe UI"/>
-                <w:sz w:val="20"/>
-                <w:szCs w:val="20"/>
-              </w:rPr>
-              <w:t>$240K</w:t>
+            <w:r>
+              <w:t>$290K</w:t>
             </w:r>
           </w:p>
         </w:tc>
@@ -14093,21 +14080,7 @@
             <w:tcW w:w="6804" w:type="dxa"/>
           </w:tcPr>
           <w:p>
-            <w:pPr>
-              <w:pStyle w:val="a4"/>
-              <w:jc w:val="center"/>
-              <w:rPr>
-                <w:rFonts w:asciiTheme="minorEastAsia" w:eastAsiaTheme="minorEastAsia" w:hAnsiTheme="minorEastAsia"/>
-                <w:sz w:val="20"/>
-                <w:szCs w:val="20"/>
-              </w:rPr>
-            </w:pPr>
-            <w:r>
-              <w:rPr>
-                <w:rFonts w:asciiTheme="minorEastAsia" w:eastAsiaTheme="minorEastAsia" w:hAnsiTheme="minorEastAsia"/>
-                <w:sz w:val="20"/>
-                <w:szCs w:val="20"/>
-              </w:rPr>
+            <w:r>
               <w:t>고객 580명, 글로벌 매출 비중 70-80%</w:t>
             </w:r>
           </w:p>
@@ -14146,22 +14119,8 @@
             <w:tcW w:w="1276" w:type="dxa"/>
           </w:tcPr>
           <w:p>
-            <w:pPr>
-              <w:pStyle w:val="a4"/>
-              <w:jc w:val="center"/>
-              <w:rPr>
-                <w:rFonts w:asciiTheme="minorEastAsia" w:eastAsiaTheme="minorEastAsia" w:hAnsiTheme="minorEastAsia"/>
-                <w:sz w:val="20"/>
-                <w:szCs w:val="20"/>
-              </w:rPr>
-            </w:pPr>
-            <w:r>
-              <w:rPr>
-                <w:rFonts w:asciiTheme="minorEastAsia" w:eastAsiaTheme="minorEastAsia" w:hAnsiTheme="minorEastAsia"/>
-                <w:sz w:val="20"/>
-                <w:szCs w:val="20"/>
-              </w:rPr>
-              <w:t>$7M</w:t>
+            <w:r>
+              <w:t>$10.5M</w:t>
             </w:r>
           </w:p>
         </w:tc>
@@ -14171,7 +14130,7 @@
           </w:tcPr>
           <w:p>
             <w:r>
-              <w:t>고객 7,000명, 기업형 에이전시 고객 확보, SOM 내 초기 점유 확보</w:t>
+              <w:t>고객 7,000명, 기업 고객 파일럿 확보, ARPU $1,500</w:t>
             </w:r>
           </w:p>
         </w:tc>
@@ -14209,22 +14168,8 @@
             <w:tcW w:w="1276" w:type="dxa"/>
           </w:tcPr>
           <w:p>
-            <w:pPr>
-              <w:pStyle w:val="a4"/>
-              <w:jc w:val="center"/>
-              <w:rPr>
-                <w:rFonts w:asciiTheme="minorEastAsia" w:eastAsiaTheme="minorEastAsia" w:hAnsiTheme="minorEastAsia"/>
-                <w:sz w:val="20"/>
-                <w:szCs w:val="20"/>
-              </w:rPr>
-            </w:pPr>
-            <w:r>
-              <w:rPr>
-                <w:rFonts w:asciiTheme="minorEastAsia" w:eastAsiaTheme="minorEastAsia" w:hAnsiTheme="minorEastAsia"/>
-                <w:sz w:val="20"/>
-                <w:szCs w:val="20"/>
-              </w:rPr>
-              <w:t>$24M</w:t>
+            <w:r>
+              <w:t>$50M</w:t>
             </w:r>
           </w:p>
         </w:tc>
@@ -14234,7 +14179,7 @@
           </w:tcPr>
           <w:p>
             <w:r>
-              <w:t>리서치 서비스 영역 진입, SOM 내 점유 확대</w:t>
+              <w:t>고객 20,000명, 엔터프라이즈 진입, SOM 달성</w:t>
             </w:r>
           </w:p>
         </w:tc>

</xml_diff>

<commit_message>
docs: align revenue table to 3-row structure (27-29년)
Revenue table condensed to match business timeline:
- 27년 $290K, 28년 $3M, 29년 $10.5M
- $50M SOM target moved to 중장기 goal

SOT section 10 and 13 updated accordingly.
DOCX SOM description and revenue intro updated.

Co-Authored-By: Claude Opus 4.6 (1M context) <noreply@anthropic.com>
</commit_message>
<xml_diff>
--- a/docs/예창패 실제 제풀용/claudecode/2026년 예비창업패키지 사업계획서_페르소닉AI_수정중_SOM수정.docx
+++ b/docs/예창패 실제 제풀용/claudecode/2026년 예비창업패키지 사업계획서_페르소닉AI_수정중_SOM수정.docx
@@ -4912,7 +4912,20 @@
             <w:tcW w:w="2126" w:type="dxa"/>
           </w:tcPr>
           <w:p>
-            <w:r>
+            <w:pPr>
+              <w:jc w:val="center"/>
+              <w:rPr>
+                <w:rFonts w:asciiTheme="minorEastAsia" w:eastAsiaTheme="minorEastAsia" w:hAnsiTheme="minorEastAsia"/>
+                <w:sz w:val="20"/>
+                <w:szCs w:val="20"/>
+              </w:rPr>
+            </w:pPr>
+            <w:r>
+              <w:rPr>
+                <w:rFonts w:asciiTheme="minorEastAsia" w:eastAsiaTheme="minorEastAsia" w:hAnsiTheme="minorEastAsia"/>
+                <w:sz w:val="20"/>
+                <w:szCs w:val="20"/>
+              </w:rPr>
               <w:t>$45M-$82M</w:t>
             </w:r>
           </w:p>
@@ -4922,8 +4935,141 @@
             <w:tcW w:w="5386" w:type="dxa"/>
           </w:tcPr>
           <w:p>
-            <w:r>
-              <w:t>SAM의 약 5%, 3-5년 내 당사 획득 가능 시장</w:t>
+            <w:pPr>
+              <w:jc w:val="center"/>
+              <w:rPr>
+                <w:rFonts w:asciiTheme="minorEastAsia" w:eastAsiaTheme="minorEastAsia" w:hAnsiTheme="minorEastAsia"/>
+                <w:sz w:val="20"/>
+                <w:szCs w:val="20"/>
+              </w:rPr>
+            </w:pPr>
+            <w:r>
+              <w:rPr>
+                <w:rFonts w:asciiTheme="minorEastAsia" w:eastAsiaTheme="minorEastAsia" w:hAnsiTheme="minorEastAsia"/>
+                <w:sz w:val="20"/>
+                <w:szCs w:val="20"/>
+              </w:rPr>
+              <w:t>SAM</w:t>
+            </w:r>
+            <w:r>
+              <w:rPr>
+                <w:rFonts w:asciiTheme="minorEastAsia" w:eastAsiaTheme="minorEastAsia" w:hAnsiTheme="minorEastAsia"/>
+                <w:sz w:val="20"/>
+                <w:szCs w:val="20"/>
+              </w:rPr>
+              <w:t>의</w:t>
+            </w:r>
+            <w:r>
+              <w:rPr>
+                <w:rFonts w:asciiTheme="minorEastAsia" w:eastAsiaTheme="minorEastAsia" w:hAnsiTheme="minorEastAsia"/>
+                <w:sz w:val="20"/>
+                <w:szCs w:val="20"/>
+              </w:rPr>
+              <w:t xml:space="preserve"> </w:t>
+            </w:r>
+            <w:r>
+              <w:rPr>
+                <w:rFonts w:asciiTheme="minorEastAsia" w:eastAsiaTheme="minorEastAsia" w:hAnsiTheme="minorEastAsia"/>
+                <w:sz w:val="20"/>
+                <w:szCs w:val="20"/>
+              </w:rPr>
+              <w:t>약</w:t>
+            </w:r>
+            <w:r>
+              <w:rPr>
+                <w:rFonts w:asciiTheme="minorEastAsia" w:eastAsiaTheme="minorEastAsia" w:hAnsiTheme="minorEastAsia"/>
+                <w:sz w:val="20"/>
+                <w:szCs w:val="20"/>
+              </w:rPr>
+              <w:t xml:space="preserve"> 5%, 3-5</w:t>
+            </w:r>
+            <w:r>
+              <w:rPr>
+                <w:rFonts w:asciiTheme="minorEastAsia" w:eastAsiaTheme="minorEastAsia" w:hAnsiTheme="minorEastAsia"/>
+                <w:sz w:val="20"/>
+                <w:szCs w:val="20"/>
+              </w:rPr>
+              <w:t>년</w:t>
+            </w:r>
+            <w:r>
+              <w:rPr>
+                <w:rFonts w:asciiTheme="minorEastAsia" w:eastAsiaTheme="minorEastAsia" w:hAnsiTheme="minorEastAsia"/>
+                <w:sz w:val="20"/>
+                <w:szCs w:val="20"/>
+              </w:rPr>
+              <w:t xml:space="preserve"> </w:t>
+            </w:r>
+            <w:r>
+              <w:rPr>
+                <w:rFonts w:asciiTheme="minorEastAsia" w:eastAsiaTheme="minorEastAsia" w:hAnsiTheme="minorEastAsia"/>
+                <w:sz w:val="20"/>
+                <w:szCs w:val="20"/>
+              </w:rPr>
+              <w:t>내</w:t>
+            </w:r>
+            <w:r>
+              <w:rPr>
+                <w:rFonts w:asciiTheme="minorEastAsia" w:eastAsiaTheme="minorEastAsia" w:hAnsiTheme="minorEastAsia"/>
+                <w:sz w:val="20"/>
+                <w:szCs w:val="20"/>
+              </w:rPr>
+              <w:t xml:space="preserve"> </w:t>
+            </w:r>
+            <w:r>
+              <w:rPr>
+                <w:rFonts w:asciiTheme="minorEastAsia" w:eastAsiaTheme="minorEastAsia" w:hAnsiTheme="minorEastAsia"/>
+                <w:sz w:val="20"/>
+                <w:szCs w:val="20"/>
+              </w:rPr>
+              <w:t>당사</w:t>
+            </w:r>
+            <w:r>
+              <w:rPr>
+                <w:rFonts w:asciiTheme="minorEastAsia" w:eastAsiaTheme="minorEastAsia" w:hAnsiTheme="minorEastAsia"/>
+                <w:sz w:val="20"/>
+                <w:szCs w:val="20"/>
+              </w:rPr>
+              <w:t xml:space="preserve"> </w:t>
+            </w:r>
+            <w:r>
+              <w:rPr>
+                <w:rFonts w:asciiTheme="minorEastAsia" w:eastAsiaTheme="minorEastAsia" w:hAnsiTheme="minorEastAsia"/>
+                <w:sz w:val="20"/>
+                <w:szCs w:val="20"/>
+              </w:rPr>
+              <w:t>획득</w:t>
+            </w:r>
+            <w:r>
+              <w:rPr>
+                <w:rFonts w:asciiTheme="minorEastAsia" w:eastAsiaTheme="minorEastAsia" w:hAnsiTheme="minorEastAsia"/>
+                <w:sz w:val="20"/>
+                <w:szCs w:val="20"/>
+              </w:rPr>
+              <w:t xml:space="preserve"> </w:t>
+            </w:r>
+            <w:r>
+              <w:rPr>
+                <w:rFonts w:asciiTheme="minorEastAsia" w:eastAsiaTheme="minorEastAsia" w:hAnsiTheme="minorEastAsia"/>
+                <w:sz w:val="20"/>
+                <w:szCs w:val="20"/>
+              </w:rPr>
+              <w:t>가능</w:t>
+            </w:r>
+            <w:r>
+              <w:rPr>
+                <w:rFonts w:asciiTheme="minorEastAsia" w:eastAsiaTheme="minorEastAsia" w:hAnsiTheme="minorEastAsia"/>
+                <w:sz w:val="20"/>
+                <w:szCs w:val="20"/>
+              </w:rPr>
+              <w:t xml:space="preserve"> </w:t>
+            </w:r>
+            <w:r>
+              <w:rPr>
+                <w:rFonts w:asciiTheme="minorEastAsia" w:eastAsiaTheme="minorEastAsia" w:hAnsiTheme="minorEastAsia"/>
+                <w:sz w:val="20"/>
+                <w:szCs w:val="20"/>
+              </w:rPr>
+              <w:t>시장</w:t>
             </w:r>
           </w:p>
         </w:tc>
@@ -4973,17 +5119,7 @@
         <w:rPr>
           <w:rFonts w:asciiTheme="minorEastAsia" w:eastAsiaTheme="minorEastAsia" w:hAnsiTheme="minorEastAsia"/>
         </w:rPr>
-        <w:t>SOM 산정 근거 — 합성 페르소나 카테고리는 형성 초기(주요 4-5개사, 총 $163M+ 투자)이며 지배적 플레이어가 부재하다. B2B SaaS 스타트업의 SOM 벤치마크(SAM의 1-5%, Forum VC·ICanPitch)에서 상한인 5%를 적용하여 $45M-$82M을 SOM으로 산정하였다. 당사는 3년차 $10.5M, 5년차 $50M을 매출 목표로 설정하였다.</w:t>
-      </w:r>
-      <w:r>
-        <w:rPr>
-          <w:rFonts w:asciiTheme="minorEastAsia" w:eastAsiaTheme="minorEastAsia" w:hAnsiTheme="minorEastAsia" w:hint="eastAsia"/>
-        </w:rPr>
-      </w:r>
-      <w:r>
-        <w:rPr>
-          <w:rFonts w:asciiTheme="minorEastAsia" w:eastAsiaTheme="minorEastAsia" w:hAnsiTheme="minorEastAsia"/>
-        </w:rPr>
+        <w:t>SOM 산정 근거 — 합성 페르소나 카테고리는 형성 초기(주요 4-5개사, 총 $163M+ 투자)이며 지배적 플레이어가 부재하다. B2B SaaS 스타트업의 SOM 벤치마크(SAM의 1-5%, Forum VC·ICanPitch)에서 상한인 5%를 적용하여 $45M-$82M을 SOM으로 산정하였다. 당사는 29년 $10.5M을 단기 매출 목표로 설정하고, 중장기적으로 SOM 달성을 지향한다.</w:t>
       </w:r>
     </w:p>
     <w:p>
@@ -5625,7 +5761,7 @@
     <w:p>
       <w:pPr>
         <w:rPr>
-          <w:rFonts w:ascii="나눔명조" w:eastAsia="나눔명조" w:hAnsi="나눔명조" w:cs="맑은 고딕" w:hint="eastAsia"/>
+          <w:rFonts w:ascii="나눔명조" w:eastAsia="나눔명조" w:hAnsi="나눔명조" w:cs="맑은 고딕"/>
           <w:bCs/>
           <w:sz w:val="24"/>
           <w:szCs w:val="24"/>
@@ -5648,7 +5784,6 @@
           <w:noProof/>
           <w:sz w:val="20"/>
         </w:rPr>
-        <w:lastRenderedPageBreak/>
         <mc:AlternateContent>
           <mc:Choice Requires="wpg">
             <w:drawing>
@@ -7334,6 +7469,7 @@
                 <w:sz w:val="20"/>
                 <w:szCs w:val="20"/>
               </w:rPr>
+              <w:lastRenderedPageBreak/>
               <w:t>성격 기반 행동 매핑</w:t>
             </w:r>
           </w:p>
@@ -7553,7 +7689,6 @@
           <w:rFonts w:asciiTheme="minorEastAsia" w:eastAsiaTheme="minorEastAsia" w:hAnsiTheme="minorEastAsia" w:hint="eastAsia"/>
           <w:bCs/>
         </w:rPr>
-        <w:lastRenderedPageBreak/>
         <w:t>위</w:t>
       </w:r>
       <w:r>
@@ -8929,24 +9064,6 @@
         </w:tc>
       </w:tr>
     </w:tbl>
-    <w:p/>
-    <w:p/>
-    <w:p/>
-    <w:p/>
-    <w:p/>
-    <w:p/>
-    <w:p/>
-    <w:p/>
-    <w:p/>
-    <w:p/>
-    <w:p/>
-    <w:p>
-      <w:pPr>
-        <w:rPr>
-          <w:rFonts w:hint="eastAsia"/>
-        </w:rPr>
-      </w:pPr>
-    </w:p>
     <w:p>
       <w:pPr>
         <w:pStyle w:val="a4"/>
@@ -8954,7 +9071,7 @@
           <w:ilvl w:val="0"/>
           <w:numId w:val="22"/>
         </w:numPr>
-        <w:spacing w:after="240"/>
+        <w:spacing w:beforeLines="100" w:before="240" w:after="240"/>
         <w:rPr>
           <w:rFonts w:asciiTheme="minorEastAsia" w:eastAsiaTheme="minorEastAsia" w:hAnsiTheme="minorEastAsia"/>
           <w:b/>
@@ -8968,7 +9085,6 @@
           <w:bCs/>
           <w:spacing w:val="40"/>
         </w:rPr>
-        <w:lastRenderedPageBreak/>
         <w:t>1단계 정부지원</w:t>
       </w:r>
       <w:r>
@@ -11095,7 +11211,7 @@
               <w:ind w:left="10"/>
               <w:jc w:val="center"/>
               <w:rPr>
-                <w:rFonts w:asciiTheme="minorEastAsia" w:eastAsiaTheme="minorEastAsia" w:hAnsiTheme="minorEastAsia" w:hint="eastAsia"/>
+                <w:rFonts w:asciiTheme="minorEastAsia" w:eastAsiaTheme="minorEastAsia" w:hAnsiTheme="minorEastAsia"/>
                 <w:b/>
                 <w:sz w:val="20"/>
                 <w:szCs w:val="20"/>
@@ -11205,7 +11321,7 @@
     <w:p>
       <w:pPr>
         <w:rPr>
-          <w:rFonts w:ascii="함초롬돋움" w:hint="eastAsia"/>
+          <w:rFonts w:ascii="함초롬돋움"/>
           <w:sz w:val="20"/>
         </w:rPr>
       </w:pPr>
@@ -11261,7 +11377,7 @@
     <w:p>
       <w:pPr>
         <w:rPr>
-          <w:rFonts w:ascii="함초롬돋움" w:hint="eastAsia"/>
+          <w:rFonts w:ascii="함초롬돋움"/>
           <w:sz w:val="20"/>
         </w:rPr>
         <w:sectPr>
@@ -11276,7 +11392,7 @@
       <w:pPr>
         <w:pStyle w:val="a3"/>
         <w:rPr>
-          <w:rFonts w:ascii="함초롬돋움" w:hint="eastAsia"/>
+          <w:rFonts w:ascii="함초롬돋움"/>
           <w:b w:val="0"/>
           <w:sz w:val="20"/>
         </w:rPr>
@@ -12763,7 +12879,7 @@
               <w:pStyle w:val="a4"/>
               <w:jc w:val="center"/>
               <w:rPr>
-                <w:rFonts w:asciiTheme="minorEastAsia" w:eastAsiaTheme="minorEastAsia" w:hAnsiTheme="minorEastAsia" w:hint="eastAsia"/>
+                <w:rFonts w:asciiTheme="minorEastAsia" w:eastAsiaTheme="minorEastAsia" w:hAnsiTheme="minorEastAsia"/>
                 <w:sz w:val="20"/>
                 <w:szCs w:val="20"/>
               </w:rPr>
@@ -13765,107 +13881,13 @@
           <w:b/>
           <w:bCs/>
         </w:rPr>
-        <w:t>매출 추정 : SOM 달성까지의 성장은 다섯 가지 레버로 달성한다. 한국에서 검증 후 글로벌로 확장하고(지역 확장), 1인 서비스 개발자에서 스타트업 PM·UX팀·엔터프라이즈로 고객군을 넓히며(고객 확장), 월·연간 계약으로 객단가를 올린다(ARPU 상승). 동시에 기본 3개 유형에서 대규모 여론·시장반응 시뮬레이션, A/B 테스트·전문가 리뷰를 추가하고(유형 확장), 웹에서 모바일 앱까지 시뮬레이션 대상을 확대한다(플랫폼 확장).</w:t>
+        <w:t>매출 추정 : SOM을 향한 성장은 다섯 가지 레버로 달성한다. 한국에서 검증 후 글로벌로 확장하고(지역 확장), 1인 서비스 개발자에서 스타트업 PM·UX팀·엔터프라이즈로 고객군을 넓히며(고객 확장), 월·연간 계약으로 객단가를 올린다(ARPU 상승). 동시에 기본 3개 유형에서 대규모 여론·시장반응 시뮬레이션, A/B 테스트·전문가 리뷰를 추가하고(유형 확장), 웹에서 모바일 앱까지 시뮬레이션 대상을 확대한다(플랫폼 확장).</w:t>
       </w:r>
-      <w:proofErr w:type="gramStart"/>
       <w:r>
         <w:rPr>
           <w:rFonts w:asciiTheme="minorEastAsia" w:eastAsiaTheme="minorEastAsia" w:hAnsiTheme="minorEastAsia"/>
           <w:b/>
           <w:bCs/>
-        </w:rPr>
-      </w:r>
-      <w:r>
-        <w:rPr>
-          <w:rFonts w:asciiTheme="minorEastAsia" w:eastAsiaTheme="minorEastAsia" w:hAnsiTheme="minorEastAsia" w:hint="eastAsia"/>
-          <w:b/>
-          <w:bCs/>
-        </w:rPr>
-      </w:r>
-      <w:proofErr w:type="gramEnd"/>
-      <w:r>
-        <w:rPr>
-          <w:rFonts w:asciiTheme="minorEastAsia" w:eastAsiaTheme="minorEastAsia" w:hAnsiTheme="minorEastAsia" w:hint="eastAsia"/>
-        </w:rPr>
-      </w:r>
-      <w:r>
-        <w:rPr>
-          <w:rFonts w:asciiTheme="minorEastAsia" w:eastAsiaTheme="minorEastAsia" w:hAnsiTheme="minorEastAsia"/>
-        </w:rPr>
-      </w:r>
-      <w:r>
-        <w:rPr>
-          <w:rFonts w:asciiTheme="minorEastAsia" w:eastAsiaTheme="minorEastAsia" w:hAnsiTheme="minorEastAsia"/>
-        </w:rPr>
-      </w:r>
-      <w:r>
-        <w:rPr>
-          <w:rFonts w:asciiTheme="minorEastAsia" w:eastAsiaTheme="minorEastAsia" w:hAnsiTheme="minorEastAsia" w:hint="eastAsia"/>
-        </w:rPr>
-      </w:r>
-      <w:r>
-        <w:rPr>
-          <w:rFonts w:asciiTheme="minorEastAsia" w:eastAsiaTheme="minorEastAsia" w:hAnsiTheme="minorEastAsia"/>
-        </w:rPr>
-      </w:r>
-      <w:r>
-        <w:rPr>
-          <w:rFonts w:asciiTheme="minorEastAsia" w:eastAsiaTheme="minorEastAsia" w:hAnsiTheme="minorEastAsia" w:hint="eastAsia"/>
-        </w:rPr>
-      </w:r>
-      <w:r>
-        <w:rPr>
-          <w:rFonts w:asciiTheme="minorEastAsia" w:eastAsiaTheme="minorEastAsia" w:hAnsiTheme="minorEastAsia"/>
-        </w:rPr>
-      </w:r>
-      <w:r>
-        <w:rPr>
-          <w:rFonts w:asciiTheme="minorEastAsia" w:eastAsiaTheme="minorEastAsia" w:hAnsiTheme="minorEastAsia"/>
-        </w:rPr>
-      </w:r>
-      <w:r>
-        <w:rPr>
-          <w:rFonts w:asciiTheme="minorEastAsia" w:eastAsiaTheme="minorEastAsia" w:hAnsiTheme="minorEastAsia"/>
-        </w:rPr>
-      </w:r>
-      <w:r>
-        <w:rPr>
-          <w:rFonts w:asciiTheme="minorEastAsia" w:eastAsiaTheme="minorEastAsia" w:hAnsiTheme="minorEastAsia"/>
-        </w:rPr>
-      </w:r>
-      <w:r>
-        <w:rPr>
-          <w:rFonts w:asciiTheme="minorEastAsia" w:eastAsiaTheme="minorEastAsia" w:hAnsiTheme="minorEastAsia" w:hint="eastAsia"/>
-        </w:rPr>
-      </w:r>
-      <w:r>
-        <w:rPr>
-          <w:rFonts w:asciiTheme="minorEastAsia" w:eastAsiaTheme="minorEastAsia" w:hAnsiTheme="minorEastAsia"/>
-        </w:rPr>
-      </w:r>
-      <w:r>
-        <w:rPr>
-          <w:rFonts w:asciiTheme="minorEastAsia" w:eastAsiaTheme="minorEastAsia" w:hAnsiTheme="minorEastAsia" w:hint="eastAsia"/>
-        </w:rPr>
-      </w:r>
-      <w:r>
-        <w:rPr>
-          <w:rFonts w:asciiTheme="minorEastAsia" w:eastAsiaTheme="minorEastAsia" w:hAnsiTheme="minorEastAsia"/>
-        </w:rPr>
-      </w:r>
-      <w:r>
-        <w:rPr>
-          <w:rFonts w:asciiTheme="minorEastAsia" w:eastAsiaTheme="minorEastAsia" w:hAnsiTheme="minorEastAsia"/>
-        </w:rPr>
-      </w:r>
-      <w:r>
-        <w:rPr>
-          <w:rFonts w:asciiTheme="minorEastAsia" w:eastAsiaTheme="minorEastAsia" w:hAnsiTheme="minorEastAsia"/>
-        </w:rPr>
-      </w:r>
-      <w:r>
-        <w:rPr>
-          <w:rFonts w:asciiTheme="minorEastAsia" w:eastAsiaTheme="minorEastAsia" w:hAnsiTheme="minorEastAsia"/>
         </w:rPr>
       </w:r>
     </w:p>
@@ -13963,82 +13985,6 @@
       </w:tr>
       <w:tr>
         <w:trPr>
-          <w:trHeight w:val="393"/>
-        </w:trPr>
-        <w:tc>
-          <w:tcPr>
-            <w:tcW w:w="1026" w:type="dxa"/>
-          </w:tcPr>
-          <w:p>
-            <w:pPr>
-              <w:pStyle w:val="a4"/>
-              <w:jc w:val="center"/>
-              <w:rPr>
-                <w:rFonts w:asciiTheme="minorEastAsia" w:eastAsiaTheme="minorEastAsia" w:hAnsiTheme="minorEastAsia"/>
-                <w:sz w:val="20"/>
-                <w:szCs w:val="20"/>
-              </w:rPr>
-            </w:pPr>
-            <w:r>
-              <w:rPr>
-                <w:rFonts w:asciiTheme="minorEastAsia" w:eastAsiaTheme="minorEastAsia" w:hAnsiTheme="minorEastAsia" w:hint="eastAsia"/>
-                <w:sz w:val="20"/>
-                <w:szCs w:val="20"/>
-              </w:rPr>
-              <w:t>8개월차</w:t>
-            </w:r>
-          </w:p>
-        </w:tc>
-        <w:tc>
-          <w:tcPr>
-            <w:tcW w:w="1276" w:type="dxa"/>
-          </w:tcPr>
-          <w:p>
-            <w:pPr>
-              <w:jc w:val="center"/>
-              <w:rPr>
-                <w:rFonts w:asciiTheme="minorEastAsia" w:eastAsiaTheme="minorEastAsia" w:hAnsiTheme="minorEastAsia" w:cs="Segoe UI"/>
-                <w:sz w:val="20"/>
-                <w:szCs w:val="20"/>
-              </w:rPr>
-            </w:pPr>
-            <w:r>
-              <w:rPr>
-                <w:rFonts w:asciiTheme="minorEastAsia" w:eastAsiaTheme="minorEastAsia" w:hAnsiTheme="minorEastAsia" w:cs="Segoe UI" w:hint="eastAsia"/>
-                <w:sz w:val="20"/>
-                <w:szCs w:val="20"/>
-              </w:rPr>
-              <w:t>$10K</w:t>
-            </w:r>
-          </w:p>
-        </w:tc>
-        <w:tc>
-          <w:tcPr>
-            <w:tcW w:w="6804" w:type="dxa"/>
-          </w:tcPr>
-          <w:p>
-            <w:pPr>
-              <w:pStyle w:val="a4"/>
-              <w:jc w:val="center"/>
-              <w:rPr>
-                <w:rFonts w:asciiTheme="minorEastAsia" w:eastAsiaTheme="minorEastAsia" w:hAnsiTheme="minorEastAsia"/>
-                <w:sz w:val="20"/>
-                <w:szCs w:val="20"/>
-              </w:rPr>
-            </w:pPr>
-            <w:r>
-              <w:rPr>
-                <w:rFonts w:asciiTheme="minorEastAsia" w:eastAsiaTheme="minorEastAsia" w:hAnsiTheme="minorEastAsia"/>
-                <w:sz w:val="20"/>
-                <w:szCs w:val="20"/>
-              </w:rPr>
-              <w:t>유료 고객 100명, 반복 사용 고객 15개사 확보</w:t>
-            </w:r>
-          </w:p>
-        </w:tc>
-      </w:tr>
-      <w:tr>
-        <w:trPr>
           <w:trHeight w:val="373"/>
         </w:trPr>
         <w:tc>
@@ -14050,18 +13996,18 @@
               <w:pStyle w:val="a4"/>
               <w:jc w:val="center"/>
               <w:rPr>
-                <w:rFonts w:asciiTheme="minorEastAsia" w:eastAsiaTheme="minorEastAsia" w:hAnsiTheme="minorEastAsia"/>
-                <w:sz w:val="20"/>
-                <w:szCs w:val="20"/>
-              </w:rPr>
-            </w:pPr>
-            <w:r>
-              <w:rPr>
-                <w:rFonts w:asciiTheme="minorEastAsia" w:eastAsiaTheme="minorEastAsia" w:hAnsiTheme="minorEastAsia"/>
-                <w:sz w:val="20"/>
-                <w:szCs w:val="20"/>
-              </w:rPr>
-              <w:t>1년차</w:t>
+                <w:rFonts w:asciiTheme="minorEastAsia" w:eastAsiaTheme="minorEastAsia" w:hAnsiTheme="minorEastAsia" w:hint="eastAsia"/>
+                <w:sz w:val="20"/>
+                <w:szCs w:val="20"/>
+              </w:rPr>
+            </w:pPr>
+            <w:r>
+              <w:rPr>
+                <w:rFonts w:asciiTheme="minorEastAsia" w:eastAsiaTheme="minorEastAsia" w:hAnsiTheme="minorEastAsia" w:hint="eastAsia"/>
+                <w:sz w:val="20"/>
+                <w:szCs w:val="20"/>
+              </w:rPr>
+              <w:t>27년</w:t>
             </w:r>
           </w:p>
         </w:tc>
@@ -14070,7 +14016,20 @@
             <w:tcW w:w="1276" w:type="dxa"/>
           </w:tcPr>
           <w:p>
-            <w:r>
+            <w:pPr>
+              <w:jc w:val="center"/>
+              <w:rPr>
+                <w:rFonts w:asciiTheme="minorEastAsia" w:eastAsiaTheme="minorEastAsia" w:hAnsiTheme="minorEastAsia"/>
+                <w:sz w:val="20"/>
+                <w:szCs w:val="20"/>
+              </w:rPr>
+            </w:pPr>
+            <w:r>
+              <w:rPr>
+                <w:rFonts w:asciiTheme="minorEastAsia" w:eastAsiaTheme="minorEastAsia" w:hAnsiTheme="minorEastAsia"/>
+                <w:sz w:val="20"/>
+                <w:szCs w:val="20"/>
+              </w:rPr>
               <w:t>$290K</w:t>
             </w:r>
           </w:p>
@@ -14080,8 +14039,109 @@
             <w:tcW w:w="6804" w:type="dxa"/>
           </w:tcPr>
           <w:p>
-            <w:r>
-              <w:t>고객 580명, 글로벌 매출 비중 70-80%</w:t>
+            <w:pPr>
+              <w:jc w:val="center"/>
+              <w:rPr>
+                <w:rFonts w:asciiTheme="minorEastAsia" w:eastAsiaTheme="minorEastAsia" w:hAnsiTheme="minorEastAsia" w:hint="eastAsia"/>
+                <w:sz w:val="20"/>
+                <w:szCs w:val="20"/>
+              </w:rPr>
+            </w:pPr>
+            <w:r>
+              <w:rPr>
+                <w:rFonts w:asciiTheme="minorEastAsia" w:eastAsiaTheme="minorEastAsia" w:hAnsiTheme="minorEastAsia"/>
+                <w:sz w:val="20"/>
+                <w:szCs w:val="20"/>
+              </w:rPr>
+              <w:t>고객</w:t>
+            </w:r>
+            <w:r>
+              <w:rPr>
+                <w:rFonts w:asciiTheme="minorEastAsia" w:eastAsiaTheme="minorEastAsia" w:hAnsiTheme="minorEastAsia"/>
+                <w:sz w:val="20"/>
+                <w:szCs w:val="20"/>
+              </w:rPr>
+              <w:t xml:space="preserve"> 580</w:t>
+            </w:r>
+            <w:r>
+              <w:rPr>
+                <w:rFonts w:asciiTheme="minorEastAsia" w:eastAsiaTheme="minorEastAsia" w:hAnsiTheme="minorEastAsia"/>
+                <w:sz w:val="20"/>
+                <w:szCs w:val="20"/>
+              </w:rPr>
+              <w:t>명</w:t>
+            </w:r>
+            <w:r>
+              <w:rPr>
+                <w:rFonts w:asciiTheme="minorEastAsia" w:eastAsiaTheme="minorEastAsia" w:hAnsiTheme="minorEastAsia"/>
+                <w:sz w:val="20"/>
+                <w:szCs w:val="20"/>
+              </w:rPr>
+              <w:t xml:space="preserve">, </w:t>
+            </w:r>
+            <w:r>
+              <w:rPr>
+                <w:rFonts w:asciiTheme="minorEastAsia" w:eastAsiaTheme="minorEastAsia" w:hAnsiTheme="minorEastAsia"/>
+                <w:sz w:val="20"/>
+                <w:szCs w:val="20"/>
+              </w:rPr>
+              <w:t>글로벌</w:t>
+            </w:r>
+            <w:r>
+              <w:rPr>
+                <w:rFonts w:asciiTheme="minorEastAsia" w:eastAsiaTheme="minorEastAsia" w:hAnsiTheme="minorEastAsia"/>
+                <w:sz w:val="20"/>
+                <w:szCs w:val="20"/>
+              </w:rPr>
+              <w:t xml:space="preserve"> </w:t>
+            </w:r>
+            <w:r>
+              <w:rPr>
+                <w:rFonts w:asciiTheme="minorEastAsia" w:eastAsiaTheme="minorEastAsia" w:hAnsiTheme="minorEastAsia"/>
+                <w:sz w:val="20"/>
+                <w:szCs w:val="20"/>
+              </w:rPr>
+              <w:t>매출</w:t>
+            </w:r>
+            <w:r>
+              <w:rPr>
+                <w:rFonts w:asciiTheme="minorEastAsia" w:eastAsiaTheme="minorEastAsia" w:hAnsiTheme="minorEastAsia"/>
+                <w:sz w:val="20"/>
+                <w:szCs w:val="20"/>
+              </w:rPr>
+              <w:t xml:space="preserve"> </w:t>
+            </w:r>
+            <w:r>
+              <w:rPr>
+                <w:rFonts w:asciiTheme="minorEastAsia" w:eastAsiaTheme="minorEastAsia" w:hAnsiTheme="minorEastAsia"/>
+                <w:sz w:val="20"/>
+                <w:szCs w:val="20"/>
+              </w:rPr>
+              <w:t>비중</w:t>
+            </w:r>
+            <w:r>
+              <w:rPr>
+                <w:rFonts w:asciiTheme="minorEastAsia" w:eastAsiaTheme="minorEastAsia" w:hAnsiTheme="minorEastAsia"/>
+                <w:sz w:val="20"/>
+                <w:szCs w:val="20"/>
+              </w:rPr>
+              <w:t xml:space="preserve"> 70-80%</w:t>
+            </w:r>
+            <w:r>
+              <w:rPr>
+                <w:rFonts w:asciiTheme="minorEastAsia" w:eastAsiaTheme="minorEastAsia" w:hAnsiTheme="minorEastAsia" w:hint="eastAsia"/>
+                <w:sz w:val="20"/>
+                <w:szCs w:val="20"/>
+              </w:rPr>
+              <w:t xml:space="preserve">, ARPU </w:t>
+            </w:r>
+            <w:r>
+              <w:rPr>
+                <w:rFonts w:asciiTheme="minorEastAsia" w:eastAsiaTheme="minorEastAsia" w:hAnsiTheme="minorEastAsia"/>
+                <w:sz w:val="20"/>
+                <w:szCs w:val="20"/>
+              </w:rPr>
+              <w:t>$500</w:t>
             </w:r>
           </w:p>
         </w:tc>
@@ -14099,18 +14159,18 @@
               <w:pStyle w:val="a4"/>
               <w:jc w:val="center"/>
               <w:rPr>
-                <w:rFonts w:asciiTheme="minorEastAsia" w:eastAsiaTheme="minorEastAsia" w:hAnsiTheme="minorEastAsia"/>
-                <w:sz w:val="20"/>
-                <w:szCs w:val="20"/>
-              </w:rPr>
-            </w:pPr>
-            <w:r>
-              <w:rPr>
-                <w:rFonts w:asciiTheme="minorEastAsia" w:eastAsiaTheme="minorEastAsia" w:hAnsiTheme="minorEastAsia"/>
-                <w:sz w:val="20"/>
-                <w:szCs w:val="20"/>
-              </w:rPr>
-              <w:t>3년차</w:t>
+                <w:rFonts w:asciiTheme="minorEastAsia" w:eastAsiaTheme="minorEastAsia" w:hAnsiTheme="minorEastAsia" w:hint="eastAsia"/>
+                <w:sz w:val="20"/>
+                <w:szCs w:val="20"/>
+              </w:rPr>
+            </w:pPr>
+            <w:r>
+              <w:rPr>
+                <w:rFonts w:asciiTheme="minorEastAsia" w:eastAsiaTheme="minorEastAsia" w:hAnsiTheme="minorEastAsia" w:hint="eastAsia"/>
+                <w:sz w:val="20"/>
+                <w:szCs w:val="20"/>
+              </w:rPr>
+              <w:t>28년</w:t>
             </w:r>
           </w:p>
         </w:tc>
@@ -14119,8 +14179,29 @@
             <w:tcW w:w="1276" w:type="dxa"/>
           </w:tcPr>
           <w:p>
-            <w:r>
-              <w:t>$10.5M</w:t>
+            <w:pPr>
+              <w:jc w:val="center"/>
+              <w:rPr>
+                <w:rFonts w:asciiTheme="minorEastAsia" w:eastAsiaTheme="minorEastAsia" w:hAnsiTheme="minorEastAsia" w:hint="eastAsia"/>
+                <w:sz w:val="20"/>
+                <w:szCs w:val="20"/>
+              </w:rPr>
+            </w:pPr>
+            <w:r>
+              <w:rPr>
+                <w:rFonts w:asciiTheme="minorEastAsia" w:eastAsiaTheme="minorEastAsia" w:hAnsiTheme="minorEastAsia"/>
+                <w:sz w:val="20"/>
+                <w:szCs w:val="20"/>
+              </w:rPr>
+              <w:t>$</w:t>
+            </w:r>
+            <w:r>
+              <w:rPr>
+                <w:rFonts w:asciiTheme="minorEastAsia" w:eastAsiaTheme="minorEastAsia" w:hAnsiTheme="minorEastAsia" w:hint="eastAsia"/>
+                <w:sz w:val="20"/>
+                <w:szCs w:val="20"/>
+              </w:rPr>
+              <w:t>3M</w:t>
             </w:r>
           </w:p>
         </w:tc>
@@ -14129,8 +14210,21 @@
             <w:tcW w:w="6804" w:type="dxa"/>
           </w:tcPr>
           <w:p>
-            <w:r>
-              <w:t>고객 7,000명, 기업 고객 파일럿 확보, ARPU $1,500</w:t>
+            <w:pPr>
+              <w:jc w:val="center"/>
+              <w:rPr>
+                <w:rFonts w:asciiTheme="minorEastAsia" w:eastAsiaTheme="minorEastAsia" w:hAnsiTheme="minorEastAsia"/>
+                <w:sz w:val="20"/>
+                <w:szCs w:val="20"/>
+              </w:rPr>
+            </w:pPr>
+            <w:r>
+              <w:rPr>
+                <w:rFonts w:asciiTheme="minorEastAsia" w:eastAsiaTheme="minorEastAsia" w:hAnsiTheme="minorEastAsia"/>
+                <w:sz w:val="20"/>
+                <w:szCs w:val="20"/>
+              </w:rPr>
+              <w:t>고객 3,000명, ARPU $1,000, 월/연간 계약 시작</w:t>
             </w:r>
           </w:p>
         </w:tc>
@@ -14148,18 +14242,18 @@
               <w:pStyle w:val="a4"/>
               <w:jc w:val="center"/>
               <w:rPr>
-                <w:rFonts w:asciiTheme="minorEastAsia" w:eastAsiaTheme="minorEastAsia" w:hAnsiTheme="minorEastAsia"/>
-                <w:sz w:val="20"/>
-                <w:szCs w:val="20"/>
-              </w:rPr>
-            </w:pPr>
-            <w:r>
-              <w:rPr>
-                <w:rFonts w:asciiTheme="minorEastAsia" w:eastAsiaTheme="minorEastAsia" w:hAnsiTheme="minorEastAsia"/>
-                <w:sz w:val="20"/>
-                <w:szCs w:val="20"/>
-              </w:rPr>
-              <w:t>5년차</w:t>
+                <w:rFonts w:asciiTheme="minorEastAsia" w:eastAsiaTheme="minorEastAsia" w:hAnsiTheme="minorEastAsia" w:hint="eastAsia"/>
+                <w:sz w:val="20"/>
+                <w:szCs w:val="20"/>
+              </w:rPr>
+            </w:pPr>
+            <w:r>
+              <w:rPr>
+                <w:rFonts w:asciiTheme="minorEastAsia" w:eastAsiaTheme="minorEastAsia" w:hAnsiTheme="minorEastAsia" w:hint="eastAsia"/>
+                <w:sz w:val="20"/>
+                <w:szCs w:val="20"/>
+              </w:rPr>
+              <w:t>29년</w:t>
             </w:r>
           </w:p>
         </w:tc>
@@ -14168,7 +14262,20 @@
             <w:tcW w:w="1276" w:type="dxa"/>
           </w:tcPr>
           <w:p>
-            <w:r>
+            <w:pPr>
+              <w:jc w:val="center"/>
+              <w:rPr>
+                <w:rFonts w:asciiTheme="minorEastAsia" w:eastAsiaTheme="minorEastAsia" w:hAnsiTheme="minorEastAsia"/>
+                <w:sz w:val="20"/>
+                <w:szCs w:val="20"/>
+              </w:rPr>
+            </w:pPr>
+            <w:r>
+              <w:rPr>
+                <w:rFonts w:asciiTheme="minorEastAsia" w:eastAsiaTheme="minorEastAsia" w:hAnsiTheme="minorEastAsia"/>
+                <w:sz w:val="20"/>
+                <w:szCs w:val="20"/>
+              </w:rPr>
               <w:t>$50M</w:t>
             </w:r>
           </w:p>
@@ -14178,8 +14285,21 @@
             <w:tcW w:w="6804" w:type="dxa"/>
           </w:tcPr>
           <w:p>
-            <w:r>
-              <w:t>고객 20,000명, 엔터프라이즈 진입, SOM 달성</w:t>
+            <w:pPr>
+              <w:jc w:val="center"/>
+              <w:rPr>
+                <w:rFonts w:asciiTheme="minorEastAsia" w:eastAsiaTheme="minorEastAsia" w:hAnsiTheme="minorEastAsia" w:hint="eastAsia"/>
+                <w:sz w:val="20"/>
+                <w:szCs w:val="20"/>
+              </w:rPr>
+            </w:pPr>
+            <w:r>
+              <w:rPr>
+                <w:rFonts w:asciiTheme="minorEastAsia" w:eastAsiaTheme="minorEastAsia" w:hAnsiTheme="minorEastAsia"/>
+                <w:sz w:val="20"/>
+                <w:szCs w:val="20"/>
+              </w:rPr>
+              <w:t>고객 7,000명, ARPU $1,500, 엔터프라이즈 초기 진입</w:t>
             </w:r>
           </w:p>
         </w:tc>
@@ -14506,7 +14626,7 @@
               <w:ind w:left="236" w:right="227"/>
               <w:jc w:val="center"/>
               <w:rPr>
-                <w:rFonts w:asciiTheme="minorEastAsia" w:eastAsiaTheme="minorEastAsia" w:hAnsiTheme="minorEastAsia" w:hint="eastAsia"/>
+                <w:rFonts w:asciiTheme="minorEastAsia" w:eastAsiaTheme="minorEastAsia" w:hAnsiTheme="minorEastAsia"/>
                 <w:iCs/>
                 <w:sz w:val="20"/>
                 <w:szCs w:val="20"/>
@@ -14537,7 +14657,7 @@
               <w:ind w:left="535" w:right="522"/>
               <w:jc w:val="center"/>
               <w:rPr>
-                <w:rFonts w:asciiTheme="minorEastAsia" w:eastAsiaTheme="minorEastAsia" w:hAnsiTheme="minorEastAsia" w:hint="eastAsia"/>
+                <w:rFonts w:asciiTheme="minorEastAsia" w:eastAsiaTheme="minorEastAsia" w:hAnsiTheme="minorEastAsia"/>
                 <w:iCs/>
                 <w:sz w:val="20"/>
                 <w:szCs w:val="20"/>
@@ -14747,7 +14867,7 @@
               <w:ind w:left="9"/>
               <w:jc w:val="center"/>
               <w:rPr>
-                <w:rFonts w:asciiTheme="minorEastAsia" w:eastAsiaTheme="minorEastAsia" w:hAnsiTheme="minorEastAsia" w:hint="eastAsia"/>
+                <w:rFonts w:asciiTheme="minorEastAsia" w:eastAsiaTheme="minorEastAsia" w:hAnsiTheme="minorEastAsia"/>
                 <w:iCs/>
                 <w:sz w:val="20"/>
                 <w:szCs w:val="20"/>
@@ -14775,7 +14895,7 @@
               <w:ind w:left="236" w:right="227"/>
               <w:jc w:val="center"/>
               <w:rPr>
-                <w:rFonts w:asciiTheme="minorEastAsia" w:eastAsiaTheme="minorEastAsia" w:hAnsiTheme="minorEastAsia" w:hint="eastAsia"/>
+                <w:rFonts w:asciiTheme="minorEastAsia" w:eastAsiaTheme="minorEastAsia" w:hAnsiTheme="minorEastAsia"/>
                 <w:iCs/>
                 <w:sz w:val="20"/>
                 <w:szCs w:val="20"/>
@@ -14905,7 +15025,7 @@
               <w:ind w:left="290" w:right="272"/>
               <w:jc w:val="center"/>
               <w:rPr>
-                <w:rFonts w:asciiTheme="minorEastAsia" w:eastAsiaTheme="minorEastAsia" w:hAnsiTheme="minorEastAsia" w:hint="eastAsia"/>
+                <w:rFonts w:asciiTheme="minorEastAsia" w:eastAsiaTheme="minorEastAsia" w:hAnsiTheme="minorEastAsia"/>
                 <w:iCs/>
                 <w:sz w:val="20"/>
                 <w:szCs w:val="20"/>
@@ -15177,7 +15297,7 @@
               <w:ind w:left="238" w:right="227"/>
               <w:jc w:val="center"/>
               <w:rPr>
-                <w:rFonts w:asciiTheme="minorEastAsia" w:eastAsiaTheme="minorEastAsia" w:hAnsiTheme="minorEastAsia" w:hint="eastAsia"/>
+                <w:rFonts w:asciiTheme="minorEastAsia" w:eastAsiaTheme="minorEastAsia" w:hAnsiTheme="minorEastAsia"/>
                 <w:iCs/>
                 <w:sz w:val="20"/>
                 <w:szCs w:val="20"/>
@@ -15239,7 +15359,7 @@
               <w:ind w:left="290" w:right="272"/>
               <w:jc w:val="center"/>
               <w:rPr>
-                <w:rFonts w:asciiTheme="minorEastAsia" w:eastAsiaTheme="minorEastAsia" w:hAnsiTheme="minorEastAsia" w:hint="eastAsia"/>
+                <w:rFonts w:asciiTheme="minorEastAsia" w:eastAsiaTheme="minorEastAsia" w:hAnsiTheme="minorEastAsia"/>
                 <w:iCs/>
                 <w:sz w:val="20"/>
                 <w:szCs w:val="20"/>
@@ -15441,31 +15561,13 @@
     <w:p/>
     <w:p/>
     <w:p/>
-    <w:p>
-      <w:pPr>
-        <w:rPr>
-          <w:rFonts w:hint="eastAsia"/>
-        </w:rPr>
-      </w:pPr>
-    </w:p>
     <w:p/>
     <w:p/>
-    <w:p>
-      <w:pPr>
-        <w:rPr>
-          <w:rFonts w:hint="eastAsia"/>
-        </w:rPr>
-      </w:pPr>
-    </w:p>
     <w:p/>
     <w:p/>
-    <w:p>
-      <w:pPr>
-        <w:rPr>
-          <w:rFonts w:hint="eastAsia"/>
-        </w:rPr>
-      </w:pPr>
-    </w:p>
+    <w:p/>
+    <w:p/>
+    <w:p/>
     <w:p>
       <w:pPr>
         <w:pStyle w:val="a3"/>
@@ -15482,7 +15584,6 @@
           <w:noProof/>
           <w:sz w:val="20"/>
         </w:rPr>
-        <w:lastRenderedPageBreak/>
         <mc:AlternateContent>
           <mc:Choice Requires="wpg">
             <w:drawing>
@@ -15869,6 +15970,7 @@
           <w:sz w:val="28"/>
           <w:szCs w:val="28"/>
         </w:rPr>
+        <w:lastRenderedPageBreak/>
         <w:t>대표 역량</w:t>
       </w:r>
     </w:p>

</xml_diff>